<commit_message>
Update JoP submission tracker
Co-Authored-By: Codex <codex@openai.com>
</commit_message>
<xml_diff>
--- a/submission/jop-2026-06-03/cover-letter.docx
+++ b/submission/jop-2026-06-03/cover-letter.docx
@@ -52,7 +52,7 @@
         <w:pStyle w:val="BodyText"/>
       </w:pPr>
       <w:r>
-        <w:t xml:space="preserve">The paper contributes to theoretical pragmatics by asking what identifying a form as an English interjection lets speakers, hearers, and analysts predict in use. It argues that interjections support projectible inferences about prosodic packaging, syntactic supplementarity, use-conditional stance, sequential position, response function, and interactional uptake. The account connects pragmatic category membership with semantics, discourse, interactional linguistics, historical pathways, and philosophy of language, while using corpus probes to show how boundary behavior and exit residues are structured.</w:t>
+        <w:t xml:space="preserve">The paper contributes to theoretical pragmatics by asking what identifying a form as an English interjection lets speakers, hearers, and analysts predict in use. It argues that interjections support projectible inferences about prosodic packaging, syntactic supplementarity, use-conditional stance, sequential position, response function, and interactional uptake. The account connects pragmatic category membership with semantics, discourse, interactional linguistics, historical pathways, and philosophy of language, while using corpus probes to show how boundary behaviour and exit residues are structured.</w:t>
       </w:r>
     </w:p>
     <w:p>
@@ -60,7 +60,7 @@
         <w:pStyle w:val="BodyText"/>
       </w:pPr>
       <w:r>
-        <w:t xml:space="preserve">This framing fits Journal of Pragmatics because the manuscript engages current pragmatic theorizing about how speakers produce and interpret language in context, and because it uses attested evidence to connect pragmatics with neighboring areas of language study.</w:t>
+        <w:t xml:space="preserve">This framing fits Journal of Pragmatics because the manuscript engages current pragmatic theorizing about how speakers produce and interpret language in context, and because it uses attested evidence to connect pragmatics with neighbouring areas of language study.</w:t>
       </w:r>
     </w:p>
     <w:p>

</xml_diff>